<commit_message>
feat(contract): save exclusively to Hop Dong, fix bilingual Chinese preamble, and add AI project title summarization
</commit_message>
<xml_diff>
--- a/Bieu Mau/Hợp đồng.docx
+++ b/Bieu Mau/Hợp đồng.docx
@@ -1271,17 +1271,15 @@
         </w:rPr>
         <w:t>}}</w:t>
       </w:r>
-    </w:p>
-    <w:p>
-      <w:pPr>
-        <w:spacing w:line="340" w:lineRule="exact"/>
+      <w:r>
         <w:rPr>
           <w:rFonts w:ascii="Times New Roman" w:hAnsi="Times New Roman"/>
           <w:sz w:val="24"/>
           <w:szCs w:val="24"/>
           <w:lang w:val="vi-VN"/>
         </w:rPr>
-      </w:pPr>
+        <w:t xml:space="preserve"> </w:t>
+      </w:r>
       <w:r>
         <w:rPr>
           <w:rFonts w:ascii="Times New Roman" w:hAnsi="Times New Roman"/>
@@ -2492,7 +2490,6 @@
           <w:szCs w:val="24"/>
           <w:lang w:eastAsia="zh-TW"/>
         </w:rPr>
-        <w:lastRenderedPageBreak/>
         <w:t>除雙方另有約定外，買方應付款日依下列比例支付之：</w:t>
       </w:r>
     </w:p>
@@ -2517,6 +2514,7 @@
           <w:sz w:val="24"/>
           <w:szCs w:val="24"/>
         </w:rPr>
+        <w:lastRenderedPageBreak/>
         <w:t xml:space="preserve">Trừ khi hai bên có thỏa thuận khác, bên A sẽ thanh toán theo tỷ lệ sau vào các ngày thanh toán: </w:t>
       </w:r>
       <w:r>
@@ -2970,17 +2968,6 @@
         </w:rPr>
         <w:t>Thanh toán 10% giá trị hợp đồng (78.153.000 VND – Bảy mươi tám triệu một trăm năm mươi ba nghìn đồng) bằng hình thức chuyển khoản T/T sau khi khách hàng hoàn tất nghiệm thu cuối cùng (FAC) và ký biên bản nghiệm thu bàn giao.</w:t>
       </w:r>
-    </w:p>
-    <w:p>
-      <w:pPr>
-        <w:tabs>
-          <w:tab w:val="left" w:pos="540"/>
-        </w:tabs>
-        <w:ind w:left="720"/>
-        <w:rPr>
-          <w:lang w:val="vi-VN"/>
-        </w:rPr>
-      </w:pPr>
       <w:r>
         <w:rPr>
           <w:rFonts w:ascii="Times New Roman" w:hAnsi="Times New Roman"/>
@@ -3671,7 +3658,6 @@
           <w:szCs w:val="24"/>
           <w:lang w:eastAsia="zh-TW"/>
         </w:rPr>
-        <w:lastRenderedPageBreak/>
         <w:t>賣方</w:t>
       </w:r>
       <w:r>
@@ -3829,6 +3815,7 @@
           <w:szCs w:val="24"/>
           <w:lang w:val="vi-VN" w:eastAsia="zh-TW"/>
         </w:rPr>
+        <w:lastRenderedPageBreak/>
         <w:t>產品</w:t>
       </w:r>
       <w:r>
@@ -4659,17 +4646,7 @@
           <w:szCs w:val="24"/>
           <w:lang w:val="vi-VN" w:eastAsia="zh-TW"/>
         </w:rPr>
-        <w:t xml:space="preserve">Trường hợp phát sinh bất cứ tranh chấp nào liên quan đến quyền sở hữu trí tuệ, Bên Bán phải chịu trách nhiệm giải quyết các tranh chấp đó và đảm bảo cho Bên Mua không bị ảnh hưởng. Trường hợp các tranh chấp dẫn đến Bên Mua không thể tiếp tục sử dụng đối tượng mua bán một cách bình </w:t>
-      </w:r>
-      <w:r>
-        <w:rPr>
-          <w:rFonts w:ascii="Times New Roman" w:hAnsi="Times New Roman"/>
-          <w:sz w:val="24"/>
-          <w:szCs w:val="24"/>
-          <w:lang w:val="vi-VN" w:eastAsia="zh-TW"/>
-        </w:rPr>
-        <w:lastRenderedPageBreak/>
-        <w:t>thường, Bên Mua được quyền yêu cầu Bên Bán thu hồi sản phẩm và hoàn trả giá trị đối tượng mua bán sau khi đã khấu trừ thời gian Bên Mua sử dụng</w:t>
+        <w:t>Trường hợp phát sinh bất cứ tranh chấp nào liên quan đến quyền sở hữu trí tuệ, Bên Bán phải chịu trách nhiệm giải quyết các tranh chấp đó và đảm bảo cho Bên Mua không bị ảnh hưởng. Trường hợp các tranh chấp dẫn đến Bên Mua không thể tiếp tục sử dụng đối tượng mua bán một cách bình thường, Bên Mua được quyền yêu cầu Bên Bán thu hồi sản phẩm và hoàn trả giá trị đối tượng mua bán sau khi đã khấu trừ thời gian Bên Mua sử dụng</w:t>
       </w:r>
       <w:r>
         <w:rPr>
@@ -4762,6 +4739,7 @@
           <w:szCs w:val="24"/>
           <w:lang w:eastAsia="zh-TW"/>
         </w:rPr>
+        <w:lastRenderedPageBreak/>
         <w:t>賣方</w:t>
       </w:r>
       <w:r>
@@ -5669,7 +5647,6 @@
           <w:szCs w:val="24"/>
           <w:lang w:eastAsia="zh-TW"/>
         </w:rPr>
-        <w:lastRenderedPageBreak/>
         <w:t>賣方</w:t>
       </w:r>
       <w:r>
@@ -5756,7 +5733,17 @@
           <w:szCs w:val="24"/>
           <w:lang w:eastAsia="zh-TW"/>
         </w:rPr>
-        <w:t>Bên bán đảm bảo rằng bên mua, nhân viên của bên mua, doanh nghiệp liên kết, khách hàng, nhà sản xuất, đại lý hoặc bất kỳ bên thứ ba nào sẽ không phải chịu bất kỳ khiếu nại hoặc yêu cầu nào về thiệt hại vật chất hoặc tài sản do hệ thống, bao gồm nhưng không giới hạn ở hợp đồng, khiếu nại hoặc yêu cầu đối với các hành vi sai trái hoặc lệnh pháp lý, v.v.</w:t>
+        <w:t xml:space="preserve">Bên bán đảm bảo rằng bên mua, nhân viên của bên mua, doanh nghiệp liên kết, khách hàng, nhà sản xuất, đại lý hoặc bất kỳ bên thứ ba nào sẽ không phải chịu bất kỳ khiếu nại hoặc yêu cầu nào về thiệt </w:t>
+      </w:r>
+      <w:r>
+        <w:rPr>
+          <w:rFonts w:ascii="Times New Roman" w:hAnsi="Times New Roman"/>
+          <w:sz w:val="24"/>
+          <w:szCs w:val="24"/>
+          <w:lang w:eastAsia="zh-TW"/>
+        </w:rPr>
+        <w:lastRenderedPageBreak/>
+        <w:t>hại vật chất hoặc tài sản do hệ thống, bao gồm nhưng không giới hạn ở hợp đồng, khiếu nại hoặc yêu cầu đối với các hành vi sai trái hoặc lệnh pháp lý, v.v.</w:t>
       </w:r>
     </w:p>
     <w:p>
@@ -6786,17 +6773,7 @@
           <w:szCs w:val="24"/>
           <w:lang w:eastAsia="zh-TW"/>
         </w:rPr>
-        <w:t xml:space="preserve">biết thông tin bí mật do thực hiện hợp đồng này, người bán chỉ có thể tiết lộ thông tin đó sau khi được người mua đồng ý trước bằng văn bản và người bán sẽ ký một thỏa thuận không thấp hơn tiêu chuẩn của hợp đồng này với bên thứ ba. Hợp đồng bảo mật, do đó cũng chịu nghĩa vụ bảo mật và vi </w:t>
-      </w:r>
-      <w:r>
-        <w:rPr>
-          <w:rFonts w:ascii="Times New Roman" w:hAnsi="Times New Roman"/>
-          <w:sz w:val="24"/>
-          <w:szCs w:val="24"/>
-          <w:lang w:eastAsia="zh-TW"/>
-        </w:rPr>
-        <w:lastRenderedPageBreak/>
-        <w:t>phạm nghĩa vụ hợp đồng được quy định trong hợp đồng này đối với thông tin bí mật, người bán chịu trách nhiệm chung và riêng với bên thứ ba.</w:t>
+        <w:t>biết thông tin bí mật do thực hiện hợp đồng này, người bán chỉ có thể tiết lộ thông tin đó sau khi được người mua đồng ý trước bằng văn bản và người bán sẽ ký một thỏa thuận không thấp hơn tiêu chuẩn của hợp đồng này với bên thứ ba. Hợp đồng bảo mật, do đó cũng chịu nghĩa vụ bảo mật và vi phạm nghĩa vụ hợp đồng được quy định trong hợp đồng này đối với thông tin bí mật, người bán chịu trách nhiệm chung và riêng với bên thứ ba.</w:t>
       </w:r>
     </w:p>
     <w:p>
@@ -7679,6 +7656,7 @@
           <w:szCs w:val="24"/>
           <w:lang w:val="vi-VN" w:eastAsia="zh-TW"/>
         </w:rPr>
+        <w:lastRenderedPageBreak/>
         <w:t>訴訟管轄</w:t>
       </w:r>
       <w:r>

</xml_diff>